<commit_message>
Bổ sung file code
</commit_message>
<xml_diff>
--- a/Session2/Baitap2/Baitap2.docx
+++ b/Session2/Baitap2/Baitap2.docx
@@ -20,61 +20,6 @@
       </w:r>
       <w:r>
         <w:br/>
-      </w:r>
-    </w:p>
-    <w:p>
-      <w:r>
-        <w:t xml:space="preserve">ALTER TABLE CUSTOMERS </w:t>
-      </w:r>
-    </w:p>
-    <w:p>
-      <w:r>
-        <w:t>MODIFY COLUMN FullName VARCHAR(100) NOT NULL;</w:t>
-      </w:r>
-    </w:p>
-    <w:p/>
-    <w:p>
-      <w:r>
-        <w:t xml:space="preserve">ALTER TABLE CUSTOMERS </w:t>
-      </w:r>
-    </w:p>
-    <w:p>
-      <w:r>
-        <w:t>MODIFY COLUMN Email VARCHAR(100) NOT NULL;</w:t>
-      </w:r>
-    </w:p>
-    <w:p/>
-    <w:p>
-      <w:r>
-        <w:t xml:space="preserve">ALTER TABLE CUSTOMERS </w:t>
-      </w:r>
-    </w:p>
-    <w:p>
-      <w:r>
-        <w:t xml:space="preserve">ADD CONSTRAINT </w:t>
-      </w:r>
-      <w:r>
-        <w:t>UC_</w:t>
-      </w:r>
-      <w:r>
-        <w:t>Email UNIQUE (Email);</w:t>
-      </w:r>
-    </w:p>
-    <w:p/>
-    <w:p>
-      <w:r>
-        <w:t xml:space="preserve">ALTER TABLE CUSTOMERS </w:t>
-      </w:r>
-    </w:p>
-    <w:p>
-      <w:r>
-        <w:t xml:space="preserve">ADD CONSTRAINT </w:t>
-      </w:r>
-      <w:r>
-        <w:t>CHK_</w:t>
-      </w:r>
-      <w:r>
-        <w:t>Age CHECK (Age &gt; 0);</w:t>
       </w:r>
     </w:p>
     <w:sectPr>

</xml_diff>